<commit_message>
docs: apply legal feedback (152-FZ) to privacy policy, consent, and offer
</commit_message>
<xml_diff>
--- a/Лицензионное соглашение.docx
+++ b/Лицензионное соглашение.docx
@@ -127,6 +127,11 @@
     </w:p>
     <w:p>
       <w:r>
+        <w:t>3.5. ПОРУЧЕНИЕ НА ОБРАБОТКУ ПЕРСОНАЛЬНЫХ ДАННЫХ: В рамках использования Программы Лицензиат (Оператор) поручает Лицензиару (лицу, осуществляющему обработку по поручению) обработку персональных данных учеников Лицензиата (клиентов) с целью обеспечения функционирования Программы. Лицензиар обязуется осуществлять сбор, запись, систематизацию, накопление, хранение, уточнение (обновление, изменение), извлечение, использование, передачу (предоставление, доступ), обезличивание, блокирование, удаление, уничтожение персональных данных исключительно в рамках указанной цели. Лицензиар обязуется соблюдать конфиденциальность персональных данных и обеспечивать безопасность персональных данных при их обработке в соответствии с требованиями ч. 3 ст. 6 и ст. 19 Федерального закона №152-ФЗ «О персональных данных».</w:t>
+      </w:r>
+    </w:p>
+    <w:p>
+      <w:r>
         <w:rPr>
           <w:b/>
           <w:bCs/>
@@ -167,13 +172,7 @@
     </w:p>
     <w:p>
       <w:r>
-        <w:t>4.5. Возврат средств</w:t>
-      </w:r>
-      <w:r>
-        <w:t>: поскольку</w:t>
-      </w:r>
-      <w:r>
-        <w:t xml:space="preserve"> предметом договора является предоставление права на использование цифрового продукта, после активации доступа на оплаченный период возврат лицензионного вознаграждения при досрочном отказе Лицензиата от использования Программы не производится.</w:t>
+        <w:t>4.5. Возврат средств: поскольку предметом договора является предоставление права на использование цифрового продукта, после активации доступа на оплаченный период возврат лицензионного вознаграждения при досрочном отказе Лицензиата от использования Программы не производится.</w:t>
       </w:r>
     </w:p>
     <w:p>
@@ -222,7 +221,10 @@
     </w:p>
     <w:p>
       <w:r>
-        <w:t>Электронная почта: [E-mail]</w:t>
+        <w:t xml:space="preserve">Электронная почта: </w:t>
+      </w:r>
+      <w:r>
+        <w:t>info@tochilka.app</w:t>
       </w:r>
     </w:p>
     <w:p/>
@@ -839,6 +841,7 @@
   <w:style w:type="character" w:default="1" w:styleId="a0">
     <w:name w:val="Default Paragraph Font"/>
     <w:uiPriority w:val="1"/>
+    <w:semiHidden/>
     <w:unhideWhenUsed/>
   </w:style>
   <w:style w:type="table" w:default="1" w:styleId="a1">

</xml_diff>